<commit_message>
docs(mom): close the loop on session 12 now that it is committed
Session 12 was drafted while its own work was still uncommitted, so it was the
one session not anchored to a commit. That work landed as b4157d4, and the entry
now reflects it.

- Attendance summary and the session 12 table both show 1 commit (b4157d4).
- The Provenance section no longer carves session 12 out as an exception; all
  twelve sessions are anchored to commits.
- Session 12 gains the three decisions taken after the first draft: putting the
  work on its own branch, committing the two screenshot folders as they stand
  rather than merging them, and recording that screenshots_new/ is the current
  set but is missing files 40 to 50.
- The broken EVIDENCE hyperlinks are recorded as a decision with its reasoning
  rather than left unmentioned, so the gap is visible in the document as well as
  in the commit history.
</commit_message>
<xml_diff>
--- a/Works/9.Minutes of Meeting.docx
+++ b/Works/9.Minutes of Meeting.docx
@@ -373,7 +373,7 @@
                 <w:i w:val="0"/>
                 <w:sz w:val="20"/>
               </w:rPr>
-              <w:t>Git commit history (45 commits) plus the working session of 30 July 2026</w:t>
+              <w:t>Git commit history, 46 commits across 12 dates</w:t>
             </w:r>
           </w:p>
         </w:tc>
@@ -431,7 +431,7 @@
           <w:i w:val="0"/>
           <w:sz w:val="22"/>
         </w:rPr>
-        <w:t>Session 12 is the only session not derived from commits: its work was not committed at the time of writing, and it is recorded from the working session itself.</w:t>
+        <w:t>All twelve sessions are now anchored to commits. Session 12 was still uncommitted when this document was first drafted; its work landed as commit b4157d4 on branch docs/testing-and-project-documents, and the entry below has been updated to match.</w:t>
       </w:r>
     </w:p>
     <w:p>
@@ -1378,7 +1378,7 @@
                 <w:i w:val="0"/>
                 <w:sz w:val="20"/>
               </w:rPr>
-              <w:t>not yet committed</w:t>
+              <w:t>1 (b4157d4)</w:t>
             </w:r>
           </w:p>
         </w:tc>
@@ -5377,7 +5377,7 @@
                 <w:i w:val="0"/>
                 <w:sz w:val="20"/>
               </w:rPr>
-              <w:t>Not yet committed at time of writing</w:t>
+              <w:t>1 (b4157d4)</w:t>
             </w:r>
           </w:p>
         </w:tc>
@@ -5536,6 +5536,48 @@
       </w:r>
     </w:p>
     <w:p>
+      <w:pPr>
+        <w:pStyle w:val="ListBullet"/>
+      </w:pPr>
+      <w:r>
+        <w:rPr>
+          <w:rFonts w:ascii="Times New Roman" w:hAnsi="Times New Roman"/>
+          <w:b w:val="0"/>
+          <w:i w:val="0"/>
+          <w:sz w:val="22"/>
+        </w:rPr>
+        <w:t>Renamed 8.Minutes of Meeting to 8.Minutes of Meeting (Template) and retitled it inside, so the blank form cannot be mistaken for the filled record.</w:t>
+      </w:r>
+    </w:p>
+    <w:p>
+      <w:pPr>
+        <w:pStyle w:val="ListBullet"/>
+      </w:pPr>
+      <w:r>
+        <w:rPr>
+          <w:rFonts w:ascii="Times New Roman" w:hAnsi="Times New Roman"/>
+          <w:b w:val="0"/>
+          <w:i w:val="0"/>
+          <w:sz w:val="22"/>
+        </w:rPr>
+        <w:t>Wrote 9.Minutes of Meeting covering all twelve sessions.</w:t>
+      </w:r>
+    </w:p>
+    <w:p>
+      <w:pPr>
+        <w:pStyle w:val="ListBullet"/>
+      </w:pPr>
+      <w:r>
+        <w:rPr>
+          <w:rFonts w:ascii="Times New Roman" w:hAnsi="Times New Roman"/>
+          <w:b w:val="0"/>
+          <w:i w:val="0"/>
+          <w:sz w:val="22"/>
+        </w:rPr>
+        <w:t>Committed the session as b4157d4 (167 files) on a new branch, docs/testing-and-project-documents.</w:t>
+      </w:r>
+    </w:p>
+    <w:p>
       <w:r>
         <w:rPr>
           <w:rFonts w:ascii="Times New Roman" w:hAnsi="Times New Roman"/>
@@ -5617,6 +5659,48 @@
       </w:r>
     </w:p>
     <w:p>
+      <w:pPr>
+        <w:pStyle w:val="ListBullet"/>
+      </w:pPr>
+      <w:r>
+        <w:rPr>
+          <w:rFonts w:ascii="Times New Roman" w:hAnsi="Times New Roman"/>
+          <w:b w:val="0"/>
+          <w:i w:val="0"/>
+          <w:sz w:val="22"/>
+        </w:rPr>
+        <w:t>The work goes on its own branch rather than onto the existing feature branch, so the documentation set can be reviewed as one unit.</w:t>
+      </w:r>
+    </w:p>
+    <w:p>
+      <w:pPr>
+        <w:pStyle w:val="ListBullet"/>
+      </w:pPr>
+      <w:r>
+        <w:rPr>
+          <w:rFonts w:ascii="Times New Roman" w:hAnsi="Times New Roman"/>
+          <w:b w:val="0"/>
+          <w:i w:val="0"/>
+          <w:sz w:val="22"/>
+        </w:rPr>
+        <w:t>The two screenshot folders are committed as they stand rather than merged. The 49 EVIDENCE hyperlinks pointing at the old screenshots/ path are left broken for now and recorded as a known gap in the commit message, so the problem is visible in the history instead of being quietly carried forward.</w:t>
+      </w:r>
+    </w:p>
+    <w:p>
+      <w:pPr>
+        <w:pStyle w:val="ListBullet"/>
+      </w:pPr>
+      <w:r>
+        <w:rPr>
+          <w:rFonts w:ascii="Times New Roman" w:hAnsi="Times New Roman"/>
+          <w:b w:val="0"/>
+          <w:i w:val="0"/>
+          <w:sz w:val="22"/>
+        </w:rPr>
+        <w:t>screenshots_new/ is the current set. It does not contain files 40 to 50, so the eleven browser-driven cases lose their images until the folders are reconciled.</w:t>
+      </w:r>
+    </w:p>
+    <w:p>
       <w:r>
         <w:rPr>
           <w:rFonts w:ascii="Times New Roman" w:hAnsi="Times New Roman"/>
@@ -5638,7 +5722,7 @@
           <w:i w:val="0"/>
           <w:sz w:val="22"/>
         </w:rPr>
-        <w:t>143 of 147 test rows complete with evidence, documents 1 to 9 in place, and the rename plan written down for after the presentation.</w:t>
+        <w:t>143 of 147 test rows complete with evidence, documents 1 to 9 in place, the rename plan written down for after the presentation, and the whole set committed as b4157d4.</w:t>
       </w:r>
     </w:p>
     <w:p/>

</xml_diff>